<commit_message>
Ruth Soriano: cierre de faltantes del Segundo Parcial
- Enlace del video de YouTube en el README y en el reporte (requisito 14 y anexos).
- Evidencias complementarias de las 3 operaciones sin caso: DOC-11, PLA-17 y USR-08
  (evidencias/complementarias/, evidencias.py --complementarias). Las 45 operaciones
  del codigo ya tienen evidencia; INVENTARIO_ENDPOINTS.md cruza cada una con sus casos.
- Reporte 4.3: filas Diseno, Tecnologia y Despliegue en las 10 fichas de microservicio,
  parrafo de evidencias complementarias y control de versiones.
</commit_message>
<xml_diff>
--- a/reporte_tecnico/Reporte_Tecnico_Segundo_Parcial_Equipo04.docx
+++ b/reporte_tecnico/Reporte_Tecnico_Segundo_Parcial_Equipo04.docx
@@ -786,7 +786,7 @@
               <w:keepNext w:val="0"/>
             </w:pPr>
             <w:r>
-              <w:t>4.2</w:t>
+              <w:t>4.3</w:t>
             </w:r>
           </w:p>
         </w:tc>
@@ -1176,6 +1176,47 @@
             </w:pPr>
             <w:r>
               <w:t>Cambio</w:t>
+            </w:r>
+          </w:p>
+        </w:tc>
+      </w:tr>
+      <w:tr>
+        <w:tc>
+          <w:tcPr>
+            <w:tcW w:type="dxa" w:w="3120"/>
+          </w:tcPr>
+          <w:p>
+            <w:pPr>
+              <w:keepNext w:val="0"/>
+            </w:pPr>
+            <w:r>
+              <w:t>4.3</w:t>
+            </w:r>
+          </w:p>
+        </w:tc>
+        <w:tc>
+          <w:tcPr>
+            <w:tcW w:type="dxa" w:w="3120"/>
+          </w:tcPr>
+          <w:p>
+            <w:pPr>
+              <w:keepNext w:val="0"/>
+            </w:pPr>
+            <w:r>
+              <w:t>13-oct-2026</w:t>
+            </w:r>
+          </w:p>
+        </w:tc>
+        <w:tc>
+          <w:tcPr>
+            <w:tcW w:type="dxa" w:w="3120"/>
+          </w:tcPr>
+          <w:p>
+            <w:pPr>
+              <w:keepNext w:val="0"/>
+            </w:pPr>
+            <w:r>
+              <w:t>Enlace del video; filas Diseño, Tecnología y Despliegue en las diez fichas de microservicio; evidencias complementarias de DOC-11, PLA-17 y USR-08.</w:t>
             </w:r>
           </w:p>
         </w:tc>
@@ -13631,6 +13672,74 @@
               <w:keepNext w:val="0"/>
             </w:pPr>
             <w:r>
+              <w:t>Diseño</w:t>
+            </w:r>
+          </w:p>
+        </w:tc>
+        <w:tc>
+          <w:tcPr>
+            <w:tcW w:w="4680" w:type="dxa"/>
+          </w:tcPr>
+          <w:p>
+            <w:pPr>
+              <w:keepNext w:val="0"/>
+              <w:rPr>
+                <w:lang w:val="es-MX"/>
+              </w:rPr>
+            </w:pPr>
+            <w:r>
+              <w:rPr>
+                <w:lang w:val="es-MX"/>
+              </w:rPr>
+              <w:t>servicios/auth/app.py sobre la plantilla comun/base.py: login con bcrypt y conteo de intentos en Redis, emisión del acceso (JWT HS256) y de una renovación opaca de un solo uso, revocación por jti y validación de la sesión.</w:t>
+            </w:r>
+          </w:p>
+        </w:tc>
+      </w:tr>
+      <w:tr>
+        <w:tc>
+          <w:tcPr>
+            <w:tcW w:w="4680" w:type="dxa"/>
+          </w:tcPr>
+          <w:p>
+            <w:pPr>
+              <w:keepNext w:val="0"/>
+            </w:pPr>
+            <w:r>
+              <w:t>Tecnología</w:t>
+            </w:r>
+          </w:p>
+        </w:tc>
+        <w:tc>
+          <w:tcPr>
+            <w:tcW w:w="4680" w:type="dxa"/>
+          </w:tcPr>
+          <w:p>
+            <w:pPr>
+              <w:keepNext w:val="0"/>
+              <w:rPr>
+                <w:lang w:val="es-MX"/>
+              </w:rPr>
+            </w:pPr>
+            <w:r>
+              <w:rPr>
+                <w:lang w:val="es-MX"/>
+              </w:rPr>
+              <w:t>Python 3.12, Flask 3.1.3 y Gunicorn 23.0 (2 workers); psycopg 3.3.5 (PostgreSQL), redis 5.2.1, pymongo 4.18.3, PyJWT 2.10.1, lxml 6.0.2 y defusedxml 0.7.1 (XML y XSD). Versiones fijadas en servicios/requirements.txt. Además bcrypt 4.2.1 para las contraseñas.</w:t>
+            </w:r>
+          </w:p>
+        </w:tc>
+      </w:tr>
+      <w:tr>
+        <w:tc>
+          <w:tcPr>
+            <w:tcW w:w="4680" w:type="dxa"/>
+          </w:tcPr>
+          <w:p>
+            <w:pPr>
+              <w:keepNext w:val="0"/>
+            </w:pPr>
+            <w:r>
               <w:lastRenderedPageBreak/>
               <w:t>Endpoints</w:t>
             </w:r>
@@ -14058,6 +14167,40 @@
                 <w:lang w:val="es-MX"/>
               </w:rPr>
               <w:t>Los otros nueve servicios y el web validan sus tokens con la misma llave y las mismas claves Redis</w:t>
+            </w:r>
+          </w:p>
+        </w:tc>
+      </w:tr>
+      <w:tr>
+        <w:tc>
+          <w:tcPr>
+            <w:tcW w:w="4680" w:type="dxa"/>
+          </w:tcPr>
+          <w:p>
+            <w:pPr>
+              <w:keepNext w:val="0"/>
+            </w:pPr>
+            <w:r>
+              <w:t>Despliegue</w:t>
+            </w:r>
+          </w:p>
+        </w:tc>
+        <w:tc>
+          <w:tcPr>
+            <w:tcW w:w="4680" w:type="dxa"/>
+          </w:tcPr>
+          <w:p>
+            <w:pPr>
+              <w:keepNext w:val="0"/>
+              <w:rPr>
+                <w:lang w:val="es-MX"/>
+              </w:rPr>
+            </w:pPr>
+            <w:r>
+              <w:rPr>
+                <w:lang w:val="es-MX"/>
+              </w:rPr>
+              <w:t>servicios/auth/Dockerfile (python:3.12-slim, usuario sin privilegios, Gunicorn con 2 workers y HEALTHCHECK sobre /health); contenedor auth en el puerto 5101; variables SECRET_KEY, PG_DSN, REDIS_URL y MONGO_URL; arranca cuando migraciones termina y redis y mongo están sanos (docker-compose.integrado.yml).</w:t>
             </w:r>
           </w:p>
         </w:tc>
@@ -14275,6 +14418,74 @@
               <w:keepNext w:val="0"/>
             </w:pPr>
             <w:r>
+              <w:t>Diseño</w:t>
+            </w:r>
+          </w:p>
+        </w:tc>
+        <w:tc>
+          <w:tcPr>
+            <w:tcW w:w="4680" w:type="dxa"/>
+          </w:tcPr>
+          <w:p>
+            <w:pPr>
+              <w:keepNext w:val="0"/>
+              <w:rPr>
+                <w:lang w:val="es-MX"/>
+              </w:rPr>
+            </w:pPr>
+            <w:r>
+              <w:rPr>
+                <w:lang w:val="es-MX"/>
+              </w:rPr>
+              <w:t>servicios/usuarios/app.py: perfil propio (GET, PATCH y PUT) y directorio administrativo con búsqueda, filtro por rol y paginación; los permisos salen de la tabla rol_permiso.</w:t>
+            </w:r>
+          </w:p>
+        </w:tc>
+      </w:tr>
+      <w:tr>
+        <w:tc>
+          <w:tcPr>
+            <w:tcW w:w="4680" w:type="dxa"/>
+          </w:tcPr>
+          <w:p>
+            <w:pPr>
+              <w:keepNext w:val="0"/>
+            </w:pPr>
+            <w:r>
+              <w:t>Tecnología</w:t>
+            </w:r>
+          </w:p>
+        </w:tc>
+        <w:tc>
+          <w:tcPr>
+            <w:tcW w:w="4680" w:type="dxa"/>
+          </w:tcPr>
+          <w:p>
+            <w:pPr>
+              <w:keepNext w:val="0"/>
+              <w:rPr>
+                <w:lang w:val="es-MX"/>
+              </w:rPr>
+            </w:pPr>
+            <w:r>
+              <w:rPr>
+                <w:lang w:val="es-MX"/>
+              </w:rPr>
+              <w:t>Python 3.12, Flask 3.1.3 y Gunicorn 23.0 (2 workers); psycopg 3.3.5 (PostgreSQL), redis 5.2.1, pymongo 4.18.3, PyJWT 2.10.1, lxml 6.0.2 y defusedxml 0.7.1 (XML y XSD). Versiones fijadas en servicios/requirements.txt.</w:t>
+            </w:r>
+          </w:p>
+        </w:tc>
+      </w:tr>
+      <w:tr>
+        <w:tc>
+          <w:tcPr>
+            <w:tcW w:w="4680" w:type="dxa"/>
+          </w:tcPr>
+          <w:p>
+            <w:pPr>
+              <w:keepNext w:val="0"/>
+            </w:pPr>
+            <w:r>
               <w:t>Endpoints</w:t>
             </w:r>
           </w:p>
@@ -14604,6 +14815,34 @@
             </w:pPr>
             <w:r>
               <w:t xml:space="preserve">Autenticación (token); app Android (perfil editable)</w:t>
+            </w:r>
+          </w:p>
+        </w:tc>
+      </w:tr>
+      <w:tr>
+        <w:tc>
+          <w:tcPr>
+            <w:tcW w:w="4680" w:type="dxa"/>
+          </w:tcPr>
+          <w:p>
+            <w:pPr>
+              <w:keepNext w:val="0"/>
+            </w:pPr>
+            <w:r>
+              <w:t>Despliegue</w:t>
+            </w:r>
+          </w:p>
+        </w:tc>
+        <w:tc>
+          <w:tcPr>
+            <w:tcW w:w="4680" w:type="dxa"/>
+          </w:tcPr>
+          <w:p>
+            <w:pPr>
+              <w:keepNext w:val="0"/>
+            </w:pPr>
+            <w:r>
+              <w:t>servicios/usuarios/Dockerfile (python:3.12-slim, usuario sin privilegios, Gunicorn con 2 workers y HEALTHCHECK sobre /health); contenedor usuarios en el puerto 5102; variables SECRET_KEY, PG_DSN, REDIS_URL y MONGO_URL; arranca cuando migraciones termina y redis y mongo están sanos (docker-compose.integrado.yml).</w:t>
             </w:r>
           </w:p>
         </w:tc>
@@ -14808,6 +15047,74 @@
               <w:keepNext w:val="0"/>
             </w:pPr>
             <w:r>
+              <w:t>Diseño</w:t>
+            </w:r>
+          </w:p>
+        </w:tc>
+        <w:tc>
+          <w:tcPr>
+            <w:tcW w:w="4680" w:type="dxa"/>
+          </w:tcPr>
+          <w:p>
+            <w:pPr>
+              <w:keepNext w:val="0"/>
+              <w:rPr>
+                <w:lang w:val="es-MX"/>
+              </w:rPr>
+            </w:pPr>
+            <w:r>
+              <w:rPr>
+                <w:lang w:val="es-MX"/>
+              </w:rPr>
+              <w:t>servicios/productos/app.py: consulta de solo lectura con filtros q, categoria_id y estatus; caché de Redis en comun/catalogo.py (cache:catalogo:productos:*, TTL 300 s).</w:t>
+            </w:r>
+          </w:p>
+        </w:tc>
+      </w:tr>
+      <w:tr>
+        <w:tc>
+          <w:tcPr>
+            <w:tcW w:w="4680" w:type="dxa"/>
+          </w:tcPr>
+          <w:p>
+            <w:pPr>
+              <w:keepNext w:val="0"/>
+            </w:pPr>
+            <w:r>
+              <w:t>Tecnología</w:t>
+            </w:r>
+          </w:p>
+        </w:tc>
+        <w:tc>
+          <w:tcPr>
+            <w:tcW w:w="4680" w:type="dxa"/>
+          </w:tcPr>
+          <w:p>
+            <w:pPr>
+              <w:keepNext w:val="0"/>
+              <w:rPr>
+                <w:lang w:val="es-MX"/>
+              </w:rPr>
+            </w:pPr>
+            <w:r>
+              <w:rPr>
+                <w:lang w:val="es-MX"/>
+              </w:rPr>
+              <w:t>Python 3.12, Flask 3.1.3 y Gunicorn 23.0 (2 workers); psycopg 3.3.5 (PostgreSQL), redis 5.2.1, pymongo 4.18.3, PyJWT 2.10.1, lxml 6.0.2 y defusedxml 0.7.1 (XML y XSD). Versiones fijadas en servicios/requirements.txt.</w:t>
+            </w:r>
+          </w:p>
+        </w:tc>
+      </w:tr>
+      <w:tr>
+        <w:tc>
+          <w:tcPr>
+            <w:tcW w:w="4680" w:type="dxa"/>
+          </w:tcPr>
+          <w:p>
+            <w:pPr>
+              <w:keepNext w:val="0"/>
+            </w:pPr>
+            <w:r>
               <w:t>Endpoints</w:t>
             </w:r>
           </w:p>
@@ -15240,6 +15547,40 @@
                 <w:lang w:val="es-MX"/>
               </w:rPr>
               <w:t>Clientes consultan productos por 5103; las altas y cambios permanecen en la web</w:t>
+            </w:r>
+          </w:p>
+        </w:tc>
+      </w:tr>
+      <w:tr>
+        <w:tc>
+          <w:tcPr>
+            <w:tcW w:w="4680" w:type="dxa"/>
+          </w:tcPr>
+          <w:p>
+            <w:pPr>
+              <w:keepNext w:val="0"/>
+            </w:pPr>
+            <w:r>
+              <w:t>Despliegue</w:t>
+            </w:r>
+          </w:p>
+        </w:tc>
+        <w:tc>
+          <w:tcPr>
+            <w:tcW w:w="4680" w:type="dxa"/>
+          </w:tcPr>
+          <w:p>
+            <w:pPr>
+              <w:keepNext w:val="0"/>
+              <w:rPr>
+                <w:lang w:val="es-MX"/>
+              </w:rPr>
+            </w:pPr>
+            <w:r>
+              <w:rPr>
+                <w:lang w:val="es-MX"/>
+              </w:rPr>
+              <w:t>servicios/productos/Dockerfile (python:3.12-slim, usuario sin privilegios, Gunicorn con 2 workers y HEALTHCHECK sobre /health); contenedor productos en el puerto 5103; variables SECRET_KEY, PG_DSN, REDIS_URL y MONGO_URL; arranca cuando migraciones termina y redis y mongo están sanos (docker-compose.integrado.yml).</w:t>
             </w:r>
           </w:p>
         </w:tc>
@@ -15443,6 +15784,74 @@
               <w:keepNext w:val="0"/>
             </w:pPr>
             <w:r>
+              <w:t>Diseño</w:t>
+            </w:r>
+          </w:p>
+        </w:tc>
+        <w:tc>
+          <w:tcPr>
+            <w:tcW w:w="4680" w:type="dxa"/>
+          </w:tcPr>
+          <w:p>
+            <w:pPr>
+              <w:keepNext w:val="0"/>
+              <w:rPr>
+                <w:lang w:val="es-MX"/>
+              </w:rPr>
+            </w:pPr>
+            <w:r>
+              <w:rPr>
+                <w:lang w:val="es-MX"/>
+              </w:rPr>
+              <w:t>servicios/pedidos/app.py: consulta con el ámbito de cada perfil, historial y cambio de estado; el trigger fn_valida_transicion decide si la transición es válida y escribe historial y auditoría.</w:t>
+            </w:r>
+          </w:p>
+        </w:tc>
+      </w:tr>
+      <w:tr>
+        <w:tc>
+          <w:tcPr>
+            <w:tcW w:w="4680" w:type="dxa"/>
+          </w:tcPr>
+          <w:p>
+            <w:pPr>
+              <w:keepNext w:val="0"/>
+            </w:pPr>
+            <w:r>
+              <w:t>Tecnología</w:t>
+            </w:r>
+          </w:p>
+        </w:tc>
+        <w:tc>
+          <w:tcPr>
+            <w:tcW w:w="4680" w:type="dxa"/>
+          </w:tcPr>
+          <w:p>
+            <w:pPr>
+              <w:keepNext w:val="0"/>
+              <w:rPr>
+                <w:lang w:val="es-MX"/>
+              </w:rPr>
+            </w:pPr>
+            <w:r>
+              <w:rPr>
+                <w:lang w:val="es-MX"/>
+              </w:rPr>
+              <w:t>Python 3.12, Flask 3.1.3 y Gunicorn 23.0 (2 workers); psycopg 3.3.5 (PostgreSQL), redis 5.2.1, pymongo 4.18.3, PyJWT 2.10.1, lxml 6.0.2 y defusedxml 0.7.1 (XML y XSD). Versiones fijadas en servicios/requirements.txt.</w:t>
+            </w:r>
+          </w:p>
+        </w:tc>
+      </w:tr>
+      <w:tr>
+        <w:tc>
+          <w:tcPr>
+            <w:tcW w:w="4680" w:type="dxa"/>
+          </w:tcPr>
+          <w:p>
+            <w:pPr>
+              <w:keepNext w:val="0"/>
+            </w:pPr>
+            <w:r>
               <w:t>Endpoints</w:t>
             </w:r>
           </w:p>
@@ -15944,6 +16353,40 @@
                 <w:lang w:val="es-MX"/>
               </w:rPr>
               <w:t>Web (detalle del pedido); entregas (los cierres van por allá)</w:t>
+            </w:r>
+          </w:p>
+        </w:tc>
+      </w:tr>
+      <w:tr>
+        <w:tc>
+          <w:tcPr>
+            <w:tcW w:w="4680" w:type="dxa"/>
+          </w:tcPr>
+          <w:p>
+            <w:pPr>
+              <w:keepNext w:val="0"/>
+            </w:pPr>
+            <w:r>
+              <w:t>Despliegue</w:t>
+            </w:r>
+          </w:p>
+        </w:tc>
+        <w:tc>
+          <w:tcPr>
+            <w:tcW w:w="4680" w:type="dxa"/>
+          </w:tcPr>
+          <w:p>
+            <w:pPr>
+              <w:keepNext w:val="0"/>
+              <w:rPr>
+                <w:lang w:val="es-MX"/>
+              </w:rPr>
+            </w:pPr>
+            <w:r>
+              <w:rPr>
+                <w:lang w:val="es-MX"/>
+              </w:rPr>
+              <w:t>servicios/pedidos/Dockerfile (python:3.12-slim, usuario sin privilegios, Gunicorn con 2 workers y HEALTHCHECK sobre /health); contenedor pedidos en el puerto 5104; variables SECRET_KEY, PG_DSN, REDIS_URL y MONGO_URL; arranca cuando migraciones termina y redis y mongo están sanos (docker-compose.integrado.yml).</w:t>
             </w:r>
           </w:p>
         </w:tc>
@@ -16149,6 +16592,74 @@
               <w:keepNext w:val="0"/>
             </w:pPr>
             <w:r>
+              <w:t>Diseño</w:t>
+            </w:r>
+          </w:p>
+        </w:tc>
+        <w:tc>
+          <w:tcPr>
+            <w:tcW w:w="4680" w:type="dxa"/>
+          </w:tcPr>
+          <w:p>
+            <w:pPr>
+              <w:keepNext w:val="0"/>
+              <w:rPr>
+                <w:lang w:val="es-MX"/>
+              </w:rPr>
+            </w:pPr>
+            <w:r>
+              <w:rPr>
+                <w:lang w:val="es-MX"/>
+              </w:rPr>
+              <w:t>servicios/entregas/app.py: paradas por ámbito (repartidor, operador y supervisor) y cierre en una sola transacción con FOR UPDATE, UUID único (id_cliente_local) y reglas RN27 a RN29; la operación se registra en MongoDB.</w:t>
+            </w:r>
+          </w:p>
+        </w:tc>
+      </w:tr>
+      <w:tr>
+        <w:tc>
+          <w:tcPr>
+            <w:tcW w:w="4680" w:type="dxa"/>
+          </w:tcPr>
+          <w:p>
+            <w:pPr>
+              <w:keepNext w:val="0"/>
+            </w:pPr>
+            <w:r>
+              <w:t>Tecnología</w:t>
+            </w:r>
+          </w:p>
+        </w:tc>
+        <w:tc>
+          <w:tcPr>
+            <w:tcW w:w="4680" w:type="dxa"/>
+          </w:tcPr>
+          <w:p>
+            <w:pPr>
+              <w:keepNext w:val="0"/>
+              <w:rPr>
+                <w:lang w:val="es-MX"/>
+              </w:rPr>
+            </w:pPr>
+            <w:r>
+              <w:rPr>
+                <w:lang w:val="es-MX"/>
+              </w:rPr>
+              <w:t>Python 3.12, Flask 3.1.3 y Gunicorn 23.0 (2 workers); psycopg 3.3.5 (PostgreSQL), redis 5.2.1, pymongo 4.18.3, PyJWT 2.10.1, lxml 6.0.2 y defusedxml 0.7.1 (XML y XSD). Versiones fijadas en servicios/requirements.txt.</w:t>
+            </w:r>
+          </w:p>
+        </w:tc>
+      </w:tr>
+      <w:tr>
+        <w:tc>
+          <w:tcPr>
+            <w:tcW w:w="4680" w:type="dxa"/>
+          </w:tcPr>
+          <w:p>
+            <w:pPr>
+              <w:keepNext w:val="0"/>
+            </w:pPr>
+            <w:r>
               <w:t>Endpoints</w:t>
             </w:r>
           </w:p>
@@ -16587,6 +17098,40 @@
                 <w:lang w:val="es-MX"/>
               </w:rPr>
               <w:t>Referencias de Documentos verificadas en MongoDB; avisos por trigger; el recorrido es responsabilidad de Seguimiento</w:t>
+            </w:r>
+          </w:p>
+        </w:tc>
+      </w:tr>
+      <w:tr>
+        <w:tc>
+          <w:tcPr>
+            <w:tcW w:w="4680" w:type="dxa"/>
+          </w:tcPr>
+          <w:p>
+            <w:pPr>
+              <w:keepNext w:val="0"/>
+            </w:pPr>
+            <w:r>
+              <w:t>Despliegue</w:t>
+            </w:r>
+          </w:p>
+        </w:tc>
+        <w:tc>
+          <w:tcPr>
+            <w:tcW w:w="4680" w:type="dxa"/>
+          </w:tcPr>
+          <w:p>
+            <w:pPr>
+              <w:keepNext w:val="0"/>
+              <w:rPr>
+                <w:lang w:val="es-MX"/>
+              </w:rPr>
+            </w:pPr>
+            <w:r>
+              <w:rPr>
+                <w:lang w:val="es-MX"/>
+              </w:rPr>
+              <w:t>servicios/entregas/Dockerfile (python:3.12-slim, usuario sin privilegios, Gunicorn con 2 workers y HEALTHCHECK sobre /health); contenedor entregas en el puerto 5105; variables SECRET_KEY, PG_DSN, REDIS_URL y MONGO_URL; arranca cuando migraciones termina y redis y mongo están sanos (docker-compose.integrado.yml).</w:t>
             </w:r>
           </w:p>
         </w:tc>
@@ -16799,6 +17344,74 @@
               <w:keepNext w:val="0"/>
             </w:pPr>
             <w:r>
+              <w:t>Diseño</w:t>
+            </w:r>
+          </w:p>
+        </w:tc>
+        <w:tc>
+          <w:tcPr>
+            <w:tcW w:w="4680" w:type="dxa"/>
+          </w:tcPr>
+          <w:p>
+            <w:pPr>
+              <w:keepNext w:val="0"/>
+              <w:rPr>
+                <w:lang w:val="es-MX"/>
+              </w:rPr>
+            </w:pPr>
+            <w:r>
+              <w:rPr>
+                <w:lang w:val="es-MX"/>
+              </w:rPr>
+              <w:t>servicios/planeacion/app.py: candidatos, decisión, simulación y escenarios; reutiliza planeacion_calc.py y las consultas del web para dar los mismos números y guarda cada simulación en MongoDB (ejecuciones_analiticas).</w:t>
+            </w:r>
+          </w:p>
+        </w:tc>
+      </w:tr>
+      <w:tr>
+        <w:tc>
+          <w:tcPr>
+            <w:tcW w:w="4680" w:type="dxa"/>
+          </w:tcPr>
+          <w:p>
+            <w:pPr>
+              <w:keepNext w:val="0"/>
+            </w:pPr>
+            <w:r>
+              <w:t>Tecnología</w:t>
+            </w:r>
+          </w:p>
+        </w:tc>
+        <w:tc>
+          <w:tcPr>
+            <w:tcW w:w="4680" w:type="dxa"/>
+          </w:tcPr>
+          <w:p>
+            <w:pPr>
+              <w:keepNext w:val="0"/>
+              <w:rPr>
+                <w:lang w:val="es-MX"/>
+              </w:rPr>
+            </w:pPr>
+            <w:r>
+              <w:rPr>
+                <w:lang w:val="es-MX"/>
+              </w:rPr>
+              <w:t>Python 3.12, Flask 3.1.3 y Gunicorn 23.0 (2 workers); psycopg 3.3.5 (PostgreSQL), redis 5.2.1, pymongo 4.18.3, PyJWT 2.10.1, lxml 6.0.2 y defusedxml 0.7.1 (XML y XSD). Versiones fijadas en servicios/requirements.txt.</w:t>
+            </w:r>
+          </w:p>
+        </w:tc>
+      </w:tr>
+      <w:tr>
+        <w:tc>
+          <w:tcPr>
+            <w:tcW w:w="4680" w:type="dxa"/>
+          </w:tcPr>
+          <w:p>
+            <w:pPr>
+              <w:keepNext w:val="0"/>
+            </w:pPr>
+            <w:r>
               <w:t>Endpoints</w:t>
             </w:r>
           </w:p>
@@ -17258,6 +17871,40 @@
               <w:t xml:space="preserve"> y las consultas del web: mismos números en web y API; escenarios </w:t>
               <w:lastRenderedPageBreak/>
               <w:t>compartidos con el web</w:t>
+            </w:r>
+          </w:p>
+        </w:tc>
+      </w:tr>
+      <w:tr>
+        <w:tc>
+          <w:tcPr>
+            <w:tcW w:w="4680" w:type="dxa"/>
+          </w:tcPr>
+          <w:p>
+            <w:pPr>
+              <w:keepNext w:val="0"/>
+            </w:pPr>
+            <w:r>
+              <w:t>Despliegue</w:t>
+            </w:r>
+          </w:p>
+        </w:tc>
+        <w:tc>
+          <w:tcPr>
+            <w:tcW w:w="4680" w:type="dxa"/>
+          </w:tcPr>
+          <w:p>
+            <w:pPr>
+              <w:keepNext w:val="0"/>
+              <w:rPr>
+                <w:lang w:val="es-MX"/>
+              </w:rPr>
+            </w:pPr>
+            <w:r>
+              <w:rPr>
+                <w:lang w:val="es-MX"/>
+              </w:rPr>
+              <w:t>servicios/planeacion/Dockerfile (python:3.12-slim, usuario sin privilegios, Gunicorn con 2 workers y HEALTHCHECK sobre /health); contenedor planeacion en el puerto 5106; variables SECRET_KEY, PG_DSN, REDIS_URL y MONGO_URL; arranca cuando migraciones termina y redis y mongo están sanos (docker-compose.integrado.yml).</w:t>
             </w:r>
           </w:p>
         </w:tc>
@@ -17470,6 +18117,74 @@
               <w:keepNext w:val="0"/>
             </w:pPr>
             <w:r>
+              <w:t>Diseño</w:t>
+            </w:r>
+          </w:p>
+        </w:tc>
+        <w:tc>
+          <w:tcPr>
+            <w:tcW w:w="4680" w:type="dxa"/>
+          </w:tcPr>
+          <w:p>
+            <w:pPr>
+              <w:keepNext w:val="0"/>
+              <w:rPr>
+                <w:lang w:val="es-MX"/>
+              </w:rPr>
+            </w:pPr>
+            <w:r>
+              <w:rPr>
+                <w:lang w:val="es-MX"/>
+              </w:rPr>
+              <w:t>servicios/documentos/app.py: archivos de hasta 5 MB en MongoDB (binario, SHA-256 y validación de la firma del archivo), referencia {tipo, id} y resumen por agregación.</w:t>
+            </w:r>
+          </w:p>
+        </w:tc>
+      </w:tr>
+      <w:tr>
+        <w:tc>
+          <w:tcPr>
+            <w:tcW w:w="4680" w:type="dxa"/>
+          </w:tcPr>
+          <w:p>
+            <w:pPr>
+              <w:keepNext w:val="0"/>
+            </w:pPr>
+            <w:r>
+              <w:t>Tecnología</w:t>
+            </w:r>
+          </w:p>
+        </w:tc>
+        <w:tc>
+          <w:tcPr>
+            <w:tcW w:w="4680" w:type="dxa"/>
+          </w:tcPr>
+          <w:p>
+            <w:pPr>
+              <w:keepNext w:val="0"/>
+              <w:rPr>
+                <w:lang w:val="es-MX"/>
+              </w:rPr>
+            </w:pPr>
+            <w:r>
+              <w:rPr>
+                <w:lang w:val="es-MX"/>
+              </w:rPr>
+              <w:t>Python 3.12, Flask 3.1.3 y Gunicorn 23.0 (2 workers); psycopg 3.3.5 (PostgreSQL), redis 5.2.1, pymongo 4.18.3, PyJWT 2.10.1, lxml 6.0.2 y defusedxml 0.7.1 (XML y XSD). Versiones fijadas en servicios/requirements.txt.</w:t>
+            </w:r>
+          </w:p>
+        </w:tc>
+      </w:tr>
+      <w:tr>
+        <w:tc>
+          <w:tcPr>
+            <w:tcW w:w="4680" w:type="dxa"/>
+          </w:tcPr>
+          <w:p>
+            <w:pPr>
+              <w:keepNext w:val="0"/>
+            </w:pPr>
+            <w:r>
               <w:t>Endpoints</w:t>
             </w:r>
           </w:p>
@@ -17831,6 +18546,40 @@
                 <w:lang w:val="es-MX"/>
               </w:rPr>
               <w:t>Entregas (evidencia del cierre); web (ver y adjuntar desde el detalle del pedido)</w:t>
+            </w:r>
+          </w:p>
+        </w:tc>
+      </w:tr>
+      <w:tr>
+        <w:tc>
+          <w:tcPr>
+            <w:tcW w:w="4680" w:type="dxa"/>
+          </w:tcPr>
+          <w:p>
+            <w:pPr>
+              <w:keepNext w:val="0"/>
+            </w:pPr>
+            <w:r>
+              <w:t>Despliegue</w:t>
+            </w:r>
+          </w:p>
+        </w:tc>
+        <w:tc>
+          <w:tcPr>
+            <w:tcW w:w="4680" w:type="dxa"/>
+          </w:tcPr>
+          <w:p>
+            <w:pPr>
+              <w:keepNext w:val="0"/>
+              <w:rPr>
+                <w:lang w:val="es-MX"/>
+              </w:rPr>
+            </w:pPr>
+            <w:r>
+              <w:rPr>
+                <w:lang w:val="es-MX"/>
+              </w:rPr>
+              <w:t>servicios/documentos/Dockerfile (python:3.12-slim, usuario sin privilegios, Gunicorn con 2 workers y HEALTHCHECK sobre /health); contenedor documentos en el puerto 5107; variables SECRET_KEY, PG_DSN, REDIS_URL y MONGO_URL; arranca cuando migraciones termina y redis y mongo están sanos (docker-compose.integrado.yml).</w:t>
             </w:r>
           </w:p>
         </w:tc>
@@ -18048,6 +18797,74 @@
               <w:keepNext w:val="0"/>
             </w:pPr>
             <w:r>
+              <w:t>Diseño</w:t>
+            </w:r>
+          </w:p>
+        </w:tc>
+        <w:tc>
+          <w:tcPr>
+            <w:tcW w:w="4680" w:type="dxa"/>
+          </w:tcPr>
+          <w:p>
+            <w:pPr>
+              <w:keepNext w:val="0"/>
+              <w:rPr>
+                <w:lang w:val="es-MX"/>
+              </w:rPr>
+            </w:pPr>
+            <w:r>
+              <w:rPr>
+                <w:lang w:val="es-MX"/>
+              </w:rPr>
+              <w:t>servicios/zonas/app.py: consulta de solo lectura de colonias con su centroide; caché de Redis en comun/catalogo.py (cache:catalogo:zonas:*, TTL 300 s).</w:t>
+            </w:r>
+          </w:p>
+        </w:tc>
+      </w:tr>
+      <w:tr>
+        <w:tc>
+          <w:tcPr>
+            <w:tcW w:w="4680" w:type="dxa"/>
+          </w:tcPr>
+          <w:p>
+            <w:pPr>
+              <w:keepNext w:val="0"/>
+            </w:pPr>
+            <w:r>
+              <w:t>Tecnología</w:t>
+            </w:r>
+          </w:p>
+        </w:tc>
+        <w:tc>
+          <w:tcPr>
+            <w:tcW w:w="4680" w:type="dxa"/>
+          </w:tcPr>
+          <w:p>
+            <w:pPr>
+              <w:keepNext w:val="0"/>
+              <w:rPr>
+                <w:lang w:val="es-MX"/>
+              </w:rPr>
+            </w:pPr>
+            <w:r>
+              <w:rPr>
+                <w:lang w:val="es-MX"/>
+              </w:rPr>
+              <w:t>Python 3.12, Flask 3.1.3 y Gunicorn 23.0 (2 workers); psycopg 3.3.5 (PostgreSQL), redis 5.2.1, pymongo 4.18.3, PyJWT 2.10.1, lxml 6.0.2 y defusedxml 0.7.1 (XML y XSD). Versiones fijadas en servicios/requirements.txt.</w:t>
+            </w:r>
+          </w:p>
+        </w:tc>
+      </w:tr>
+      <w:tr>
+        <w:tc>
+          <w:tcPr>
+            <w:tcW w:w="4680" w:type="dxa"/>
+          </w:tcPr>
+          <w:p>
+            <w:pPr>
+              <w:keepNext w:val="0"/>
+            </w:pPr>
+            <w:r>
               <w:t>Endpoints</w:t>
             </w:r>
           </w:p>
@@ -18362,6 +19179,40 @@
                 <w:lang w:val="es-MX"/>
               </w:rPr>
               <w:t>El tablero web obtiene de Zonas el ejemplo XML</w:t>
+            </w:r>
+          </w:p>
+        </w:tc>
+      </w:tr>
+      <w:tr>
+        <w:tc>
+          <w:tcPr>
+            <w:tcW w:w="4680" w:type="dxa"/>
+          </w:tcPr>
+          <w:p>
+            <w:pPr>
+              <w:keepNext w:val="0"/>
+            </w:pPr>
+            <w:r>
+              <w:t>Despliegue</w:t>
+            </w:r>
+          </w:p>
+        </w:tc>
+        <w:tc>
+          <w:tcPr>
+            <w:tcW w:w="4680" w:type="dxa"/>
+          </w:tcPr>
+          <w:p>
+            <w:pPr>
+              <w:keepNext w:val="0"/>
+              <w:rPr>
+                <w:lang w:val="es-MX"/>
+              </w:rPr>
+            </w:pPr>
+            <w:r>
+              <w:rPr>
+                <w:lang w:val="es-MX"/>
+              </w:rPr>
+              <w:t>servicios/zonas/Dockerfile (python:3.12-slim, usuario sin privilegios, Gunicorn con 2 workers y HEALTHCHECK sobre /health); contenedor zonas en el puerto 5108; variables SECRET_KEY, PG_DSN, REDIS_URL y MONGO_URL; arranca cuando migraciones termina y redis y mongo están sanos (docker-compose.integrado.yml).</w:t>
             </w:r>
           </w:p>
         </w:tc>
@@ -18565,6 +19416,74 @@
               <w:keepNext w:val="0"/>
             </w:pPr>
             <w:r>
+              <w:t>Diseño</w:t>
+            </w:r>
+          </w:p>
+        </w:tc>
+        <w:tc>
+          <w:tcPr>
+            <w:tcW w:w="4680" w:type="dxa"/>
+          </w:tcPr>
+          <w:p>
+            <w:pPr>
+              <w:keepNext w:val="0"/>
+              <w:rPr>
+                <w:lang w:val="es-MX"/>
+              </w:rPr>
+            </w:pPr>
+            <w:r>
+              <w:rPr>
+                <w:lang w:val="es-MX"/>
+              </w:rPr>
+              <w:t>servicios/microhubs/app.py: consulta de solo lectura de microhubs con coordenadas, radio y estatus; caché de Redis en comun/catalogo.py (cache:catalogo:microhubs:*, TTL 300 s).</w:t>
+            </w:r>
+          </w:p>
+        </w:tc>
+      </w:tr>
+      <w:tr>
+        <w:tc>
+          <w:tcPr>
+            <w:tcW w:w="4680" w:type="dxa"/>
+          </w:tcPr>
+          <w:p>
+            <w:pPr>
+              <w:keepNext w:val="0"/>
+            </w:pPr>
+            <w:r>
+              <w:t>Tecnología</w:t>
+            </w:r>
+          </w:p>
+        </w:tc>
+        <w:tc>
+          <w:tcPr>
+            <w:tcW w:w="4680" w:type="dxa"/>
+          </w:tcPr>
+          <w:p>
+            <w:pPr>
+              <w:keepNext w:val="0"/>
+              <w:rPr>
+                <w:lang w:val="es-MX"/>
+              </w:rPr>
+            </w:pPr>
+            <w:r>
+              <w:rPr>
+                <w:lang w:val="es-MX"/>
+              </w:rPr>
+              <w:t>Python 3.12, Flask 3.1.3 y Gunicorn 23.0 (2 workers); psycopg 3.3.5 (PostgreSQL), redis 5.2.1, pymongo 4.18.3, PyJWT 2.10.1, lxml 6.0.2 y defusedxml 0.7.1 (XML y XSD). Versiones fijadas en servicios/requirements.txt.</w:t>
+            </w:r>
+          </w:p>
+        </w:tc>
+      </w:tr>
+      <w:tr>
+        <w:tc>
+          <w:tcPr>
+            <w:tcW w:w="4680" w:type="dxa"/>
+          </w:tcPr>
+          <w:p>
+            <w:pPr>
+              <w:keepNext w:val="0"/>
+            </w:pPr>
+            <w:r>
               <w:t>Endpoints</w:t>
             </w:r>
           </w:p>
@@ -18879,6 +19798,40 @@
                 <w:lang w:val="es-MX"/>
               </w:rPr>
               <w:t>Consulta de la red operativa por clientes HTTP</w:t>
+            </w:r>
+          </w:p>
+        </w:tc>
+      </w:tr>
+      <w:tr>
+        <w:tc>
+          <w:tcPr>
+            <w:tcW w:w="4680" w:type="dxa"/>
+          </w:tcPr>
+          <w:p>
+            <w:pPr>
+              <w:keepNext w:val="0"/>
+            </w:pPr>
+            <w:r>
+              <w:t>Despliegue</w:t>
+            </w:r>
+          </w:p>
+        </w:tc>
+        <w:tc>
+          <w:tcPr>
+            <w:tcW w:w="4680" w:type="dxa"/>
+          </w:tcPr>
+          <w:p>
+            <w:pPr>
+              <w:keepNext w:val="0"/>
+              <w:rPr>
+                <w:lang w:val="es-MX"/>
+              </w:rPr>
+            </w:pPr>
+            <w:r>
+              <w:rPr>
+                <w:lang w:val="es-MX"/>
+              </w:rPr>
+              <w:t>servicios/microhubs/Dockerfile (python:3.12-slim, usuario sin privilegios, Gunicorn con 2 workers y HEALTHCHECK sobre /health); contenedor microhubs en el puerto 5109; variables SECRET_KEY, PG_DSN, REDIS_URL y MONGO_URL; arranca cuando migraciones termina y redis y mongo están sanos (docker-compose.integrado.yml).</w:t>
             </w:r>
           </w:p>
         </w:tc>
@@ -19082,6 +20035,74 @@
               <w:keepNext w:val="0"/>
             </w:pPr>
             <w:r>
+              <w:t>Diseño</w:t>
+            </w:r>
+          </w:p>
+        </w:tc>
+        <w:tc>
+          <w:tcPr>
+            <w:tcW w:w="4680" w:type="dxa"/>
+          </w:tcPr>
+          <w:p>
+            <w:pPr>
+              <w:keepNext w:val="0"/>
+              <w:rPr>
+                <w:lang w:val="es-MX"/>
+              </w:rPr>
+            </w:pPr>
+            <w:r>
+              <w:rPr>
+                <w:lang w:val="es-MX"/>
+              </w:rPr>
+              <w:t>servicios/seguimiento/app.py: puntos GPS en lotes de hasta 500 guardados en MongoDB (ubicaciones_entrega, índice 2dsphere) y recorrido por agregación con distancia Haversine; PostgreSQL solo para el ámbito del perfil.</w:t>
+            </w:r>
+          </w:p>
+        </w:tc>
+      </w:tr>
+      <w:tr>
+        <w:tc>
+          <w:tcPr>
+            <w:tcW w:w="4680" w:type="dxa"/>
+          </w:tcPr>
+          <w:p>
+            <w:pPr>
+              <w:keepNext w:val="0"/>
+            </w:pPr>
+            <w:r>
+              <w:t>Tecnología</w:t>
+            </w:r>
+          </w:p>
+        </w:tc>
+        <w:tc>
+          <w:tcPr>
+            <w:tcW w:w="4680" w:type="dxa"/>
+          </w:tcPr>
+          <w:p>
+            <w:pPr>
+              <w:keepNext w:val="0"/>
+              <w:rPr>
+                <w:lang w:val="es-MX"/>
+              </w:rPr>
+            </w:pPr>
+            <w:r>
+              <w:rPr>
+                <w:lang w:val="es-MX"/>
+              </w:rPr>
+              <w:t>Python 3.12, Flask 3.1.3 y Gunicorn 23.0 (2 workers); psycopg 3.3.5 (PostgreSQL), redis 5.2.1, pymongo 4.18.3, PyJWT 2.10.1, lxml 6.0.2 y defusedxml 0.7.1 (XML y XSD). Versiones fijadas en servicios/requirements.txt.</w:t>
+            </w:r>
+          </w:p>
+        </w:tc>
+      </w:tr>
+      <w:tr>
+        <w:tc>
+          <w:tcPr>
+            <w:tcW w:w="4680" w:type="dxa"/>
+          </w:tcPr>
+          <w:p>
+            <w:pPr>
+              <w:keepNext w:val="0"/>
+            </w:pPr>
+            <w:r>
               <w:t>Endpoints</w:t>
             </w:r>
           </w:p>
@@ -19396,6 +20417,40 @@
                 <w:lang w:val="es-MX"/>
               </w:rPr>
               <w:t>El portal obtiene el recorrido de Seguimiento; el cierre permanece en Entregas</w:t>
+            </w:r>
+          </w:p>
+        </w:tc>
+      </w:tr>
+      <w:tr>
+        <w:tc>
+          <w:tcPr>
+            <w:tcW w:w="4680" w:type="dxa"/>
+          </w:tcPr>
+          <w:p>
+            <w:pPr>
+              <w:keepNext w:val="0"/>
+            </w:pPr>
+            <w:r>
+              <w:t>Despliegue</w:t>
+            </w:r>
+          </w:p>
+        </w:tc>
+        <w:tc>
+          <w:tcPr>
+            <w:tcW w:w="4680" w:type="dxa"/>
+          </w:tcPr>
+          <w:p>
+            <w:pPr>
+              <w:keepNext w:val="0"/>
+              <w:rPr>
+                <w:lang w:val="es-MX"/>
+              </w:rPr>
+            </w:pPr>
+            <w:r>
+              <w:rPr>
+                <w:lang w:val="es-MX"/>
+              </w:rPr>
+              <w:t>servicios/seguimiento/Dockerfile (python:3.12-slim, usuario sin privilegios, Gunicorn con 2 workers y HEALTHCHECK sobre /health); contenedor seguimiento en el puerto 5110; variables SECRET_KEY, PG_DSN, REDIS_URL y MONGO_URL; arranca cuando migraciones termina y redis y mongo están sanos (docker-compose.integrado.yml).</w:t>
             </w:r>
           </w:p>
         </w:tc>
@@ -22993,6 +24048,19 @@
       </w:pPr>
       <w:r>
         <w:rPr>
+          <w:lang w:val="es-MX"/>
+        </w:rPr>
+        <w:t>Evidencias complementarias. La corrida principal no ejercitaba tres de las 45 operaciones del código: GET /api/v1/documentos/resumen (DOC-11), GET /api/v1/escenarios (PLA-17) y PUT /api/v1/usuarios/yo (USR-08). Se ejecutaron aparte, el 13 de octubre de 2026 a las 21:34 de Monterrey (03:34 UTC del 14 de octubre), con evidencias.py --complementarias; sus archivos están en evidencias/complementarias/ y los 3 casos pasan. Con ellas las 45 operaciones tienen evidencia; el cruce entre cada operación y sus casos está en servicios/INVENTARIO_ENDPOINTS.md.</w:t>
+      </w:r>
+    </w:p>
+    <w:p>
+      <w:pPr>
+        <w:rPr>
+          <w:lang w:val="es-MX"/>
+        </w:rPr>
+      </w:pPr>
+      <w:r>
+        <w:rPr>
           <w:b/>
           <w:lang w:val="es-MX"/>
         </w:rPr>
@@ -29241,7 +30309,7 @@
               <w:rPr>
                 <w:lang w:val="es-MX"/>
               </w:rPr>
-              <w:t>Enlace por agregar en el apartado 41</w:t>
+              <w:t>Video publicado: https://youtu.be/wEvJhCQN4rM (apartado 41 y README)</w:t>
             </w:r>
           </w:p>
         </w:tc>
@@ -29254,7 +30322,7 @@
               <w:keepNext w:val="0"/>
             </w:pPr>
             <w:r>
-              <w:t>Pendiente</w:t>
+              <w:t>Video cumplido; presentación en clase</w:t>
             </w:r>
           </w:p>
         </w:tc>
@@ -31299,14 +32367,7 @@
               <w:rPr>
                 <w:lang w:val="es-MX"/>
               </w:rPr>
-              <w:t xml:space="preserve">Enlace de YouTube: </w:t>
-            </w:r>
-            <w:r>
-              <w:rPr>
-                <w:i/>
-                <w:lang w:val="es-MX"/>
-              </w:rPr>
-              <w:t>por agregar</w:t>
+              <w:t>Enlace de YouTube: https://youtu.be/wEvJhCQN4rM</w:t>
             </w:r>
           </w:p>
         </w:tc>

</xml_diff>

<commit_message>
Ruth Soriano: cifras de pruebas, actores y tabla de servicios
- Reporte: actores sin el servicio de notificaciones (entregas, seguimiento y documentos
  para el repartidor; bandeja del portal para los avisos) y cifras de pruebas de Android
  (46 + 3) y escritorio (64) al dia.
- Presentacion: la diapositiva 8 lista un servicio por fila (10 filas) y la 27 indica
  cada servicio con su puerto.
- Documentacion de la app de escritorio con 35 + 29 = 64 comprobaciones.
</commit_message>
<xml_diff>
--- a/reporte_tecnico/Reporte_Tecnico_Segundo_Parcial_Equipo04.docx
+++ b/reporte_tecnico/Reporte_Tecnico_Segundo_Parcial_Equipo04.docx
@@ -3271,7 +3271,7 @@
               <w:rPr>
                 <w:lang w:val="es-MX"/>
               </w:rPr>
-              <w:t>Web, servicio de pedidos y notificaciones</w:t>
+              <w:t>Web, servicio de pedidos y bandeja de avisos del portal</w:t>
             </w:r>
           </w:p>
         </w:tc>
@@ -3377,7 +3377,7 @@
               <w:rPr>
                 <w:lang w:val="es-MX"/>
               </w:rPr>
-              <w:t>Servicios de entregas, documentos y notificaciones</w:t>
+              <w:t>Servicios de entregas, seguimiento y documentos; avisos en la bandeja del portal</w:t>
             </w:r>
           </w:p>
         </w:tc>
@@ -29303,26 +29303,7 @@
           <w:b/>
           <w:lang w:val="es-MX"/>
         </w:rPr>
-        <w:t>Aplicaciones Android y de escritorio (adicionales)</w:t>
-      </w:r>
-      <w:r>
-        <w:rPr>
-          <w:lang w:val="es-MX"/>
-        </w:rPr>
-        <w:t>: ya se probaron contra estos servicios el 13 de octubre (Android: 47 pruebas unitarias, 3 contra los servicios reales y 7 en emulador; escritorio: 62 comprobaciones y 10 de XSD). Falta ensayar cámara, QR y GPS en un teléfono físico (</w:t>
-      </w:r>
-      <w:r>
-        <w:rPr>
-          <w:rStyle w:val="CodeChar"/>
-          <w:lang w:val="es-MX"/>
-        </w:rPr>
-        <w:t>app_escritorio/PRUEBAS_APPS.md</w:t>
-      </w:r>
-      <w:r>
-        <w:rPr>
-          <w:lang w:val="es-MX"/>
-        </w:rPr>
-        <w:t>).</w:t>
+        <w:t>Aplicaciones Android y de escritorio (adicionales): se probaron contra los diez servicios el 13 de octubre, ya con la separación de responsabilidades (Android: 46 pruebas unitarias y 3 contra los servicios reales, más 7 en emulador que se ejecutaron antes de retirar la bandeja de notificaciones y no se repitieron; escritorio: 64 comprobaciones (35 sin red y 29 contra los servicios) y 10 de XSD). Falta ensayar cámara, QR y GPS en un teléfono físico (app_escritorio/PRUEBAS_APPS.md).</w:t>
       </w:r>
     </w:p>
     <w:p>

</xml_diff>

<commit_message>
Ruth Soriano: capturas 13 a 26 renovadas contra los diez servicios
- Figuras 13 a 26 del reporte y de capturas/ recapturadas sobre el despliegue actual:
  Swagger (auth y entregas), portal web (microservicios, pedido, reportes, cobertura,
  simulacion, bitacora, aviso de la clienta) y salidas de terminal (MongoDB, Redis,
  evidencias, compose y flujo de PowerShell con el servicio de seguimiento).
- La clave de demostracion se enmascara en la figura 15; las salidas de terminal se
  conservan como texto en capturas/salidas_terminal/.
- Reporte: figuras sustituidas y ajustadas a la pagina, pies 19 y 24 corregidos y estados
  de pruebas actualizados (14, 7, 5, 35 y 26 reglas SQL ejecutadas el 13 de octubre).
- capturas/LEEME.md y README describen como se obtuvo cada figura.
</commit_message>
<xml_diff>
--- a/reporte_tecnico/Reporte_Tecnico_Segundo_Parcial_Equipo04.docx
+++ b/reporte_tecnico/Reporte_Tecnico_Segundo_Parcial_Equipo04.docx
@@ -1216,7 +1216,7 @@
               <w:keepNext w:val="0"/>
             </w:pPr>
             <w:r>
-              <w:t>Enlace del video; filas Diseño, Tecnología y Despliegue en las diez fichas de microservicio; evidencias complementarias de DOC-11, PLA-17 y USR-08.</w:t>
+              <w:t>Enlace del video; filas Diseño, Tecnología y Despliegue en las diez fichas; evidencias complementarias de DOC-11, PLA-17 y USR-08; figuras 13 a 26 renovadas contra el despliegue actual; pruebas del repositorio ejecutadas de nuevo.</w:t>
             </w:r>
           </w:p>
         </w:tc>
@@ -11428,73 +11428,7 @@
         <w:rPr>
           <w:lang w:val="es-MX"/>
         </w:rPr>
-        <w:t>La figura 13 conserva una captura histórica del despliegue anterior. Sus cantidades describen ese momento y no el estado actual. La ejecución de evidencias adjunta registra operaciones sobre documentos, ubicaciones_entrega, sincronizaciones_moviles, ejecuciones_analiticas, logs_tecnicos y metricas_servicio; no se asume que sus totales permanezcan constantes.</w:t>
-      </w:r>
-      <w:r>
-        <w:rPr>
-          <w:rStyle w:val="CodeChar"/>
-          <w:lang w:val="es-MX"/>
-        </w:rPr>
-      </w:r>
-      <w:r>
-        <w:rPr>
-          <w:lang w:val="es-MX"/>
-        </w:rPr>
-      </w:r>
-      <w:r>
-        <w:rPr>
-          <w:rStyle w:val="CodeChar"/>
-          <w:lang w:val="es-MX"/>
-        </w:rPr>
-      </w:r>
-      <w:r>
-        <w:rPr>
-          <w:lang w:val="es-MX"/>
-        </w:rPr>
-      </w:r>
-      <w:r>
-        <w:rPr>
-          <w:rStyle w:val="CodeChar"/>
-          <w:lang w:val="es-MX"/>
-        </w:rPr>
-      </w:r>
-      <w:r>
-        <w:rPr>
-          <w:lang w:val="es-MX"/>
-        </w:rPr>
-      </w:r>
-      <w:r>
-        <w:rPr>
-          <w:rStyle w:val="CodeChar"/>
-          <w:lang w:val="es-MX"/>
-        </w:rPr>
-      </w:r>
-      <w:r>
-        <w:rPr>
-          <w:lang w:val="es-MX"/>
-        </w:rPr>
-      </w:r>
-      <w:r>
-        <w:rPr>
-          <w:rStyle w:val="CodeChar"/>
-          <w:lang w:val="es-MX"/>
-        </w:rPr>
-      </w:r>
-      <w:r>
-        <w:rPr>
-          <w:lang w:val="es-MX"/>
-        </w:rPr>
-      </w:r>
-      <w:r>
-        <w:rPr>
-          <w:rStyle w:val="CodeChar"/>
-          <w:lang w:val="es-MX"/>
-        </w:rPr>
-      </w:r>
-      <w:r>
-        <w:rPr>
-          <w:lang w:val="es-MX"/>
-        </w:rPr>
+        <w:t>La figura 13 es la salida real de mongosh sobre el despliegue actual (13 de octubre de 2026, noche); sus cantidades describen ese momento y cambian con cada ejecución. La ejecución de evidencias adjunta registra operaciones sobre documentos, ubicaciones_entrega, sincronizaciones_moviles, ejecuciones_analiticas, logs_tecnicos y metricas_servicio; no se asume que sus totales permanezcan constantes.</w:t>
       </w:r>
     </w:p>
     <w:p>
@@ -11504,7 +11438,7 @@
         </w:rPr>
         <w:drawing>
           <wp:inline distT="0" distB="0" distL="0" distR="0" wp14:anchorId="27D53735" wp14:editId="39B3A9B2">
-            <wp:extent cx="5486400" cy="625032"/>
+            <wp:extent cx="5486400" cy="1100937"/>
             <wp:effectExtent l="0" t="0" r="0" b="0"/>
             <wp:docPr id="2" name="image2" descr="Colecciones de MongoDB con documentos"/>
             <wp:cNvGraphicFramePr/>
@@ -11524,7 +11458,7 @@
                   <pic:spPr>
                     <a:xfrm>
                       <a:off x="0" y="0"/>
-                      <a:ext cx="5486400" cy="625032"/>
+                      <a:ext cx="5486400" cy="1100937"/>
                     </a:xfrm>
                     <a:prstGeom prst="rect">
                       <a:avLst/>
@@ -12493,7 +12427,7 @@
         <w:lastRenderedPageBreak/>
         <w:drawing>
           <wp:inline distT="0" distB="0" distL="0" distR="0" wp14:anchorId="3C81E968" wp14:editId="5EE40928">
-            <wp:extent cx="5486400" cy="981418"/>
+            <wp:extent cx="5486400" cy="2161641"/>
             <wp:effectExtent l="0" t="0" r="0" b="0"/>
             <wp:docPr id="3" name="image3" descr="Claves de Redis en uso"/>
             <wp:cNvGraphicFramePr/>
@@ -12513,7 +12447,7 @@
                   <pic:spPr>
                     <a:xfrm>
                       <a:off x="0" y="0"/>
-                      <a:ext cx="5486400" cy="981418"/>
+                      <a:ext cx="5486400" cy="2161641"/>
                     </a:xfrm>
                     <a:prstGeom prst="rect">
                       <a:avLst/>
@@ -23237,7 +23171,7 @@
         </w:rPr>
         <w:drawing>
           <wp:inline distT="0" distB="0" distL="0" distR="0" wp14:anchorId="6D401D38" wp14:editId="4FADD771">
-            <wp:extent cx="5486400" cy="5115752"/>
+            <wp:extent cx="5452927" cy="7680960"/>
             <wp:effectExtent l="0" t="0" r="0" b="0"/>
             <wp:docPr id="4" name="image4" descr="Swagger: login ejecutado"/>
             <wp:cNvGraphicFramePr/>
@@ -23257,7 +23191,7 @@
                   <pic:spPr>
                     <a:xfrm>
                       <a:off x="0" y="0"/>
-                      <a:ext cx="5486400" cy="5115752"/>
+                      <a:ext cx="5452927" cy="7680960"/>
                     </a:xfrm>
                     <a:prstGeom prst="rect">
                       <a:avLst/>
@@ -23305,7 +23239,7 @@
         <w:lastRenderedPageBreak/>
         <w:drawing>
           <wp:inline distT="0" distB="0" distL="0" distR="0" wp14:anchorId="5B2EEBAE" wp14:editId="3214660D">
-            <wp:extent cx="5486400" cy="5724540"/>
+            <wp:extent cx="5104687" cy="7680960"/>
             <wp:effectExtent l="0" t="0" r="0" b="0"/>
             <wp:docPr id="5" name="image5" descr="Swagger: mis entregas con Bearer"/>
             <wp:cNvGraphicFramePr/>
@@ -23325,7 +23259,7 @@
                   <pic:spPr>
                     <a:xfrm>
                       <a:off x="0" y="0"/>
-                      <a:ext cx="5486400" cy="5724540"/>
+                      <a:ext cx="5104687" cy="7680960"/>
                     </a:xfrm>
                     <a:prstGeom prst="rect">
                       <a:avLst/>
@@ -23402,84 +23336,7 @@
         <w:rPr>
           <w:lang w:val="es-MX"/>
         </w:rPr>
-        <w:t>El archivo evidencias/evidencias.md indica una ejecución del 13 de octubre de 2026 a las 21:27 UTC (15:27 de Monterrey). evidencias.json y pruebas.md registran 93 casos aprobados de 93 sobre los diez servicios. Se conserva la solicitud, respuesta, código HTTP, tiempo, traza y comprobación de datos de cada caso. Esta actualización analiza esa evidencia adjunta y no afirma haber vuelto a ejecutar los servicios.</w:t>
-      </w:r>
-      <w:r>
-        <w:rPr>
-          <w:rStyle w:val="CodeChar"/>
-          <w:lang w:val="es-MX"/>
-        </w:rPr>
-      </w:r>
-      <w:r>
-        <w:rPr>
-          <w:lang w:val="es-MX"/>
-        </w:rPr>
-      </w:r>
-      <w:r>
-        <w:rPr>
-          <w:rStyle w:val="CodeChar"/>
-          <w:lang w:val="es-MX"/>
-        </w:rPr>
-      </w:r>
-      <w:r>
-        <w:rPr>
-          <w:lang w:val="es-MX"/>
-        </w:rPr>
-      </w:r>
-      <w:r>
-        <w:rPr>
-          <w:b/>
-          <w:lang w:val="es-MX"/>
-        </w:rPr>
-      </w:r>
-      <w:r>
-        <w:rPr>
-          <w:lang w:val="es-MX"/>
-        </w:rPr>
-      </w:r>
-      <w:r>
-        <w:rPr>
-          <w:rStyle w:val="CodeChar"/>
-          <w:lang w:val="es-MX"/>
-        </w:rPr>
-      </w:r>
-      <w:r>
-        <w:rPr>
-          <w:lang w:val="es-MX"/>
-        </w:rPr>
-      </w:r>
-      <w:r>
-        <w:rPr>
-          <w:rStyle w:val="CodeChar"/>
-          <w:lang w:val="es-MX"/>
-        </w:rPr>
-      </w:r>
-      <w:r>
-        <w:rPr>
-          <w:lang w:val="es-MX"/>
-        </w:rPr>
-      </w:r>
-      <w:r>
-        <w:rPr>
-          <w:rStyle w:val="CodeChar"/>
-          <w:lang w:val="es-MX"/>
-        </w:rPr>
-      </w:r>
-      <w:r>
-        <w:rPr>
-          <w:lang w:val="es-MX"/>
-        </w:rPr>
-      </w:r>
-      <w:r>
-        <w:rPr>
-          <w:rStyle w:val="CodeChar"/>
-          <w:lang w:val="es-MX"/>
-        </w:rPr>
-      </w:r>
-      <w:r>
-        <w:rPr>
-          <w:lang w:val="es-MX"/>
-        </w:rPr>
+        <w:t>El archivo evidencias/evidencias.md indica una ejecución del 13 de octubre de 2026 a las 21:27 UTC (15:27 de Monterrey). evidencias.json y pruebas.md registran 93 casos aprobados de 93 sobre los diez servicios. Se conserva la solicitud, respuesta, código HTTP, tiempo, traza y comprobación de datos de cada caso. Los 93 casos de esa corrida no se reemplazan; las figuras 13 a 26 sí se renovaron ejecutando los servicios.</w:t>
       </w:r>
     </w:p>
     <w:tbl>
@@ -23956,7 +23813,7 @@
         <w:lastRenderedPageBreak/>
         <w:drawing>
           <wp:inline distT="0" distB="0" distL="0" distR="0" wp14:anchorId="539BD384" wp14:editId="1C0E6425">
-            <wp:extent cx="5486400" cy="4531360"/>
+            <wp:extent cx="5486400" cy="3899001"/>
             <wp:effectExtent l="0" t="0" r="0" b="0"/>
             <wp:docPr id="6" name="image6" descr="93 de 93 casos pasan"/>
             <wp:cNvGraphicFramePr/>
@@ -23976,7 +23833,7 @@
                   <pic:spPr>
                     <a:xfrm>
                       <a:off x="0" y="0"/>
-                      <a:ext cx="5486400" cy="4531360"/>
+                      <a:ext cx="5486400" cy="3899001"/>
                     </a:xfrm>
                     <a:prstGeom prst="rect">
                       <a:avLst/>
@@ -24521,7 +24378,7 @@
         <w:rPr>
           <w:lang w:val="es-MX"/>
         </w:rPr>
-        <w:t>Las capturas manuales previas se conservan como evidencia histórica. La evidencia vigente para las rutas GPS es SEG-01 y SEG-02, bajo /api/v1/seguimiento/{id}; las rutas antiguas bajo /entregas/{id}/ubicaciones o /recorrido ya no corresponden al contrato desplegado.</w:t>
+        <w:t>Las capturas del anexo E2 se renovaron contra el despliegue actual; la figura 25 muestra el flujo completo con el servicio de seguimiento. La evidencia vigente para las rutas GPS es SEG-01 y SEG-02, bajo /api/v1/seguimiento/{id}; las rutas antiguas bajo /entregas/{id}/ubicaciones o /recorrido ya no corresponden al contrato desplegado.</w:t>
       </w:r>
     </w:p>
     <w:p>
@@ -24960,7 +24817,7 @@
         </w:rPr>
         <w:drawing>
           <wp:inline distT="0" distB="0" distL="0" distR="0" wp14:anchorId="6F249636" wp14:editId="69A38D5A">
-            <wp:extent cx="5486400" cy="6597111"/>
+            <wp:extent cx="5366609" cy="7680960"/>
             <wp:effectExtent l="0" t="0" r="0" b="0"/>
             <wp:docPr id="7" name="image7" descr="Pantalla Microservicios del web"/>
             <wp:cNvGraphicFramePr/>
@@ -24980,7 +24837,7 @@
                   <pic:spPr>
                     <a:xfrm>
                       <a:off x="0" y="0"/>
-                      <a:ext cx="5486400" cy="6597111"/>
+                      <a:ext cx="5366609" cy="7680960"/>
                     </a:xfrm>
                     <a:prstGeom prst="rect">
                       <a:avLst/>
@@ -25015,7 +24872,7 @@
         <w:lastRenderedPageBreak/>
         <w:drawing>
           <wp:inline distT="0" distB="0" distL="0" distR="0" wp14:anchorId="427299BA" wp14:editId="41803ADA">
-            <wp:extent cx="5486400" cy="7355330"/>
+            <wp:extent cx="4704128" cy="7680960"/>
             <wp:effectExtent l="0" t="0" r="0" b="0"/>
             <wp:docPr id="8" name="image8" descr="Pedido armado por los servicios"/>
             <wp:cNvGraphicFramePr/>
@@ -25035,7 +24892,7 @@
                   <pic:spPr>
                     <a:xfrm>
                       <a:off x="0" y="0"/>
-                      <a:ext cx="5486400" cy="7355330"/>
+                      <a:ext cx="4704128" cy="7680960"/>
                     </a:xfrm>
                     <a:prstGeom prst="rect">
                       <a:avLst/>
@@ -25059,20 +24916,7 @@
           <w:i/>
           <w:lang w:val="es-MX"/>
         </w:rPr>
-        <w:t>Figura 19. Pedido armado por el web con los servicios de pedidos, entregas y documentos: historial de estados, recorrido GPS y evidencia de la entrega.</w:t>
-      </w:r>
-      <w:r>
-        <w:rPr>
-          <w:rStyle w:val="CodeChar"/>
-          <w:i/>
-          <w:lang w:val="es-MX"/>
-        </w:rPr>
-      </w:r>
-      <w:r>
-        <w:rPr>
-          <w:i/>
-          <w:lang w:val="es-MX"/>
-        </w:rPr>
+        <w:t>Figura 19. Pedido armado por el web con los servicios de pedidos, entregas, seguimiento y documentos: historial de estados, recorrido GPS y evidencia de la entrega.</w:t>
       </w:r>
     </w:p>
     <w:p>
@@ -25534,7 +25378,7 @@
         <w:lastRenderedPageBreak/>
         <w:drawing>
           <wp:inline distT="0" distB="0" distL="0" distR="0" wp14:anchorId="6F5EA591" wp14:editId="1D02ACDB">
-            <wp:extent cx="5486400" cy="5324627"/>
+            <wp:extent cx="5486400" cy="7020877"/>
             <wp:effectExtent l="0" t="0" r="0" b="0"/>
             <wp:docPr id="9" name="image9" descr="Reportes con Highcharts"/>
             <wp:cNvGraphicFramePr/>
@@ -25554,7 +25398,7 @@
                   <pic:spPr>
                     <a:xfrm>
                       <a:off x="0" y="0"/>
-                      <a:ext cx="5486400" cy="5324627"/>
+                      <a:ext cx="5486400" cy="7020877"/>
                     </a:xfrm>
                     <a:prstGeom prst="rect">
                       <a:avLst/>
@@ -25947,7 +25791,7 @@
         <w:lastRenderedPageBreak/>
         <w:drawing>
           <wp:inline distT="0" distB="0" distL="0" distR="0" wp14:anchorId="0AAE06BC" wp14:editId="5144FE1D">
-            <wp:extent cx="5486400" cy="5420806"/>
+            <wp:extent cx="5486400" cy="7329487"/>
             <wp:effectExtent l="0" t="0" r="0" b="0"/>
             <wp:docPr id="10" name="image10" descr="Cobertura y mapa"/>
             <wp:cNvGraphicFramePr/>
@@ -25967,7 +25811,7 @@
                   <pic:spPr>
                     <a:xfrm>
                       <a:off x="0" y="0"/>
-                      <a:ext cx="5486400" cy="5420806"/>
+                      <a:ext cx="5486400" cy="7329487"/>
                     </a:xfrm>
                     <a:prstGeom prst="rect">
                       <a:avLst/>
@@ -26002,7 +25846,7 @@
         <w:lastRenderedPageBreak/>
         <w:drawing>
           <wp:inline distT="0" distB="0" distL="0" distR="0" wp14:anchorId="5ED571A1" wp14:editId="3D751830">
-            <wp:extent cx="5486400" cy="5091694"/>
+            <wp:extent cx="4545366" cy="7680959"/>
             <wp:effectExtent l="0" t="0" r="0" b="0"/>
             <wp:docPr id="11" name="image11" descr="Simulación de operación"/>
             <wp:cNvGraphicFramePr/>
@@ -26022,7 +25866,7 @@
                   <pic:spPr>
                     <a:xfrm>
                       <a:off x="0" y="0"/>
-                      <a:ext cx="5486400" cy="5091694"/>
+                      <a:ext cx="4545366" cy="7680959"/>
                     </a:xfrm>
                     <a:prstGeom prst="rect">
                       <a:avLst/>
@@ -26876,7 +26720,7 @@
         </w:rPr>
         <w:drawing>
           <wp:inline distT="0" distB="0" distL="0" distR="0" wp14:anchorId="502DB617" wp14:editId="04AF633B">
-            <wp:extent cx="5486400" cy="914400"/>
+            <wp:extent cx="5486400" cy="2311603"/>
             <wp:effectExtent l="0" t="0" r="0" b="0"/>
             <wp:docPr id="12" name="image12" descr="Contenedores sanos"/>
             <wp:cNvGraphicFramePr/>
@@ -26896,7 +26740,7 @@
                   <pic:spPr>
                     <a:xfrm>
                       <a:off x="0" y="0"/>
-                      <a:ext cx="5486400" cy="914400"/>
+                      <a:ext cx="5486400" cy="2311603"/>
                     </a:xfrm>
                     <a:prstGeom prst="rect">
                       <a:avLst/>
@@ -27062,7 +26906,7 @@
         <w:lastRenderedPageBreak/>
         <w:drawing>
           <wp:inline distT="0" distB="0" distL="0" distR="0" wp14:anchorId="577E7DDD" wp14:editId="2AAF604D">
-            <wp:extent cx="5486400" cy="5572875"/>
+            <wp:extent cx="5486400" cy="5062061"/>
             <wp:effectExtent l="0" t="0" r="0" b="0"/>
             <wp:docPr id="13" name="image13" descr="Bitácora con eventos de los servicios"/>
             <wp:cNvGraphicFramePr/>
@@ -27082,7 +26926,7 @@
                   <pic:spPr>
                     <a:xfrm>
                       <a:off x="0" y="0"/>
-                      <a:ext cx="5486400" cy="5572875"/>
+                      <a:ext cx="5486400" cy="5062061"/>
                     </a:xfrm>
                     <a:prstGeom prst="rect">
                       <a:avLst/>
@@ -27106,7 +26950,7 @@
           <w:i/>
           <w:lang w:val="es-MX"/>
         </w:rPr>
-        <w:t>Figura 24. Bitácora del web: el login «Inicio de sesión por API (PowerShell)», la modificación de la entrega 129 y el cambio del pedido 1 a entregado, hechos por el repartidor a través de los microservicios.</w:t>
+        <w:t>Figura 24. Bitácora del web: el login «Inicio de sesión por API (PowerShell)», la modificación de la entrega 142 y el cambio del pedido 166 a entregado, hechos por el repartidor a través de los microservicios.</w:t>
       </w:r>
     </w:p>
     <w:p>
@@ -27302,7 +27146,7 @@
               <w:keepNext w:val="0"/>
             </w:pPr>
             <w:r>
-              <w:t>Resultado previo reportado; no reejecutado en esta revisión</w:t>
+              <w:t>14 pruebas aprobadas (13 de octubre de 2026)</w:t>
             </w:r>
           </w:p>
         </w:tc>
@@ -27315,7 +27159,7 @@
               <w:keepNext w:val="0"/>
             </w:pPr>
             <w:r>
-              <w:t>Histórico</w:t>
+              <w:t>Aprobada</w:t>
             </w:r>
           </w:p>
         </w:tc>
@@ -27407,7 +27251,7 @@
               <w:keepNext w:val="0"/>
             </w:pPr>
             <w:r>
-              <w:t>Resultado previo reportado; no reejecutado en esta revisión</w:t>
+              <w:t>7 pruebas aprobadas (13 de octubre de 2026)</w:t>
             </w:r>
           </w:p>
         </w:tc>
@@ -27420,7 +27264,7 @@
               <w:keepNext w:val="0"/>
             </w:pPr>
             <w:r>
-              <w:t>Histórico</w:t>
+              <w:t>Aprobada</w:t>
             </w:r>
           </w:p>
         </w:tc>
@@ -27512,7 +27356,7 @@
               <w:keepNext w:val="0"/>
             </w:pPr>
             <w:r>
-              <w:t>Resultado previo reportado; no reejecutado en esta revisión</w:t>
+              <w:t>5 pruebas aprobadas (13 de octubre de 2026)</w:t>
             </w:r>
           </w:p>
         </w:tc>
@@ -27525,7 +27369,7 @@
               <w:keepNext w:val="0"/>
             </w:pPr>
             <w:r>
-              <w:t>Histórico</w:t>
+              <w:t>Aprobada</w:t>
             </w:r>
           </w:p>
         </w:tc>
@@ -27693,7 +27537,7 @@
               <w:keepNext w:val="0"/>
             </w:pPr>
             <w:r>
-              <w:t>Resultado previo reportado; no reejecutado en esta revisión</w:t>
+              <w:t>35 pruebas aprobadas (13 de octubre de 2026)</w:t>
             </w:r>
           </w:p>
         </w:tc>
@@ -27706,7 +27550,7 @@
               <w:keepNext w:val="0"/>
             </w:pPr>
             <w:r>
-              <w:t>Histórico</w:t>
+              <w:t>Aprobada</w:t>
             </w:r>
           </w:p>
         </w:tc>
@@ -27995,7 +27839,7 @@
               <w:keepNext w:val="0"/>
             </w:pPr>
             <w:r>
-              <w:t>Resultado previo reportado; no reejecutado en esta revisión</w:t>
+              <w:t>26 verificaciones PASA y ROLLBACK (13 de octubre de 2026)</w:t>
             </w:r>
           </w:p>
         </w:tc>
@@ -28008,7 +27852,7 @@
               <w:keepNext w:val="0"/>
             </w:pPr>
             <w:r>
-              <w:t>Histórico</w:t>
+              <w:t>Aprobada</w:t>
             </w:r>
           </w:p>
         </w:tc>
@@ -28084,7 +27928,7 @@
               <w:keepNext w:val="0"/>
             </w:pPr>
             <w:r>
-              <w:t>Compose revisado; renovar captura del entorno</w:t>
+              <w:t>15 contenedores definidos: 14 sanos y migraciones en Exited (0); ver figura 23</w:t>
             </w:r>
           </w:p>
         </w:tc>
@@ -28097,7 +27941,7 @@
               <w:keepNext w:val="0"/>
             </w:pPr>
             <w:r>
-              <w:t>Por verificar</w:t>
+              <w:t>Verificado</w:t>
             </w:r>
           </w:p>
         </w:tc>
@@ -28140,7 +27984,7 @@
         <w:rPr>
           <w:lang w:val="es-MX"/>
         </w:rPr>
-        <w:t>Flujo documentado con los casos de la ejecución adjunta del 13 de octubre de 2026. Las capturas manuales de la versión anterior se conservan identificadas como históricas.</w:t>
+        <w:t>Flujo documentado con los casos de la ejecución adjunta del 13 de octubre de 2026. Las capturas del anexo E2 se renovaron el 13 de octubre de 2026 contra el despliegue de diez servicios.</w:t>
       </w:r>
     </w:p>
     <w:p>
@@ -28407,7 +28251,7 @@
         <w:rPr>
           <w:lang w:val="es-MX"/>
         </w:rPr>
-        <w:t>Evidencia vigente: anexo E1. Capturas manuales históricas: anexo E2.</w:t>
+        <w:t>Evidencia vigente: anexo E1. Capturas renovadas: anexo E2.</w:t>
       </w:r>
     </w:p>
     <w:p>
@@ -28418,7 +28262,7 @@
         <w:lastRenderedPageBreak/>
         <w:drawing>
           <wp:inline distT="0" distB="0" distL="0" distR="0" wp14:anchorId="250E3BB9" wp14:editId="2E15E234">
-            <wp:extent cx="5486400" cy="2898189"/>
+            <wp:extent cx="5486400" cy="4376210"/>
             <wp:effectExtent l="0" t="0" r="0" b="0"/>
             <wp:docPr id="14" name="image14" descr="Cierre desde PowerShell"/>
             <wp:cNvGraphicFramePr/>
@@ -28438,7 +28282,7 @@
                   <pic:spPr>
                     <a:xfrm>
                       <a:off x="0" y="0"/>
-                      <a:ext cx="5486400" cy="2898189"/>
+                      <a:ext cx="5486400" cy="4376210"/>
                     </a:xfrm>
                     <a:prstGeom prst="rect">
                       <a:avLst/>
@@ -28498,7 +28342,7 @@
         </w:rPr>
         <w:drawing>
           <wp:inline distT="0" distB="0" distL="0" distR="0" wp14:anchorId="1893AEFF" wp14:editId="74AD38C3">
-            <wp:extent cx="5486400" cy="2543694"/>
+            <wp:extent cx="5486400" cy="2336006"/>
             <wp:effectExtent l="0" t="0" r="0" b="0"/>
             <wp:docPr id="15" name="image15" descr="Aviso a la clienta"/>
             <wp:cNvGraphicFramePr/>
@@ -28518,7 +28362,7 @@
                   <pic:spPr>
                     <a:xfrm>
                       <a:off x="0" y="0"/>
-                      <a:ext cx="5486400" cy="2543694"/>
+                      <a:ext cx="5486400" cy="2336006"/>
                     </a:xfrm>
                     <a:prstGeom prst="rect">
                       <a:avLst/>
@@ -30105,7 +29949,7 @@
               <w:keepNext w:val="0"/>
             </w:pPr>
             <w:r>
-              <w:t>10 Dockerfiles y Compose con 15 contenedores definidos</w:t>
+              <w:t>10 Dockerfiles y Compose con 15 contenedores definidos, levantados y sanos</w:t>
             </w:r>
           </w:p>
         </w:tc>
@@ -30118,7 +29962,7 @@
               <w:keepNext w:val="0"/>
             </w:pPr>
             <w:r>
-              <w:t>Configurado; renovar captura</w:t>
+              <w:t>Cumplido; ver figura 23</w:t>
             </w:r>
           </w:p>
         </w:tc>
@@ -30183,7 +30027,7 @@
               <w:keepNext w:val="0"/>
             </w:pPr>
             <w:r>
-              <w:t>Suites presentes; resultados previos y evidencia adjunta</w:t>
+              <w:t>Cumplido; suites ejecutadas el 13 de octubre de 2026 y evidencia adjunta</w:t>
             </w:r>
           </w:p>
         </w:tc>
@@ -30363,7 +30207,7 @@
               <w:keepNext w:val="0"/>
             </w:pPr>
             <w:r>
-              <w:t>Evidencia adjunta; capturas manuales históricas</w:t>
+              <w:t>Evidencia adjunta; capturas renovadas</w:t>
             </w:r>
           </w:p>
         </w:tc>
@@ -32151,7 +31995,7 @@
               <w:rPr>
                 <w:lang w:val="es-MX"/>
               </w:rPr>
-              <w:t>Capturas manuales históricas y diagramas vigentes; consultar capturas/LEEME.md</w:t>
+              <w:t>Capturas renovadas y diagramas vigentes; consultar capturas/LEEME.md</w:t>
             </w:r>
           </w:p>
         </w:tc>

</xml_diff>